<commit_message>
Recupera 2015-2016 como dato REAL desde la tabla municipal (.dbf)
El pico histórico 2015-2016 dejaba de ser estimado: aunque su geometría
(.shp) se perdió, sobrevive Defor2015_2016_Mpios_Proj_Correg.dbf con el
área real por municipio y clase de los 19 municipios (San Juan de Urabá
con 0 ha). El ETL ahora la lee directamente (fuente dbf-municipal,
estimado=false), en vez de estimar por cruce con cuencas.

- Deforestación 2015-2016: 4.970 ha (estimado) -> 5.771 ha (medido)
- Total 2000-2024: 46.041 -> 46.846 ha; periodos estimados: 4 -> 3
- Actualiza notas del frontend (dashboard, footer, aprende, descargas,
  page, serie API) y regenera Excel (0 errores) e informe Word
- 2010-2012, 2018-2019 y 2023-2024 siguen sin ser recuperables

Co-Authored-By: Claude Opus 4.8 <noreply@anthropic.com>
</commit_message>
<xml_diff>
--- a/entregables/Informe_Deforestacion_CORPOURABA_2000-2024.docx
+++ b/entregables/Informe_Deforestacion_CORPOURABA_2000-2024.docx
@@ -211,7 +211,7 @@
           <w:sz w:val="22"/>
           <w:szCs w:val="22"/>
         </w:rPr>
-        <w:t xml:space="preserve">46.044 hectáreas</w:t>
+        <w:t xml:space="preserve">46.846 hectáreas</w:t>
       </w:r>
       <w:r>
         <w:rPr>
@@ -295,7 +295,7 @@
           <w:sz w:val="22"/>
           <w:szCs w:val="22"/>
         </w:rPr>
-        <w:t xml:space="preserve">, con 4.970 ha deforestadas (4.970 ha/año), mientras que el menor registro correspondió a </w:t>
+        <w:t xml:space="preserve">, con 5.771 ha deforestadas (5.771 ha/año), mientras que el menor registro correspondió a </w:t>
       </w:r>
       <w:r>
         <w:rPr>
@@ -327,7 +327,7 @@
           <w:sz w:val="22"/>
           <w:szCs w:val="22"/>
         </w:rPr>
-        <w:t xml:space="preserve"> (12.830 ha acumuladas), y la subregión más golpeada es </w:t>
+        <w:t xml:space="preserve"> (13.309 ha acumuladas), y la subregión más golpeada es </w:t>
       </w:r>
       <w:r>
         <w:rPr>
@@ -343,7 +343,7 @@
           <w:sz w:val="22"/>
           <w:szCs w:val="22"/>
         </w:rPr>
-        <w:t xml:space="preserve"> (24.098 ha).</w:t>
+        <w:t xml:space="preserve"> (24.438 ha).</w:t>
       </w:r>
     </w:p>
     <w:p>
@@ -1648,7 +1648,7 @@
           <w:sz w:val="22"/>
           <w:szCs w:val="22"/>
         </w:rPr>
-        <w:t xml:space="preserve">2015-2016 proviene del cruce con cuencas (cobertura parcial). Se calibra con factores municipio×clase derivados de 2016-2017 (único periodo con ambas fuentes) y se marca estimado=true. Murindó y Vigía del Fuerte se interpolan.</w:t>
+        <w:t xml:space="preserve">2015-2016 se calcula con la tabla de atributos municipal oficial (Defor2015_2016_Mpios_Proj_Correg.dbf): área real por municipio y clase de los 19 municipios (San Juan de Urabá con 0 ha de deforestación). Es dato MEDIDO (estimado=false), no una estimación. La geometría (.shp) de este periodo no se conservó, por lo que no aparece en el visor de polígonos, pero las cifras del dashboard y la serie son reales.</w:t>
       </w:r>
     </w:p>
     <w:p>
@@ -1669,7 +1669,7 @@
           <w:sz w:val="22"/>
           <w:szCs w:val="22"/>
         </w:rPr>
-        <w:t xml:space="preserve">La deforestación acumulada en la jurisdicción entre 2000 y 2024 asciende a 46.044 ha. La tabla siguiente resume la serie por periodo; los periodos marcados con asterisco (*) contienen valores estimados o calibrados.</w:t>
+        <w:t xml:space="preserve">La deforestación acumulada en la jurisdicción entre 2000 y 2024 asciende a 46.846 ha. La tabla siguiente resume la serie por periodo; los periodos marcados con asterisco (*) contienen valores estimados o calibrados.</w:t>
       </w:r>
     </w:p>
     <w:p>
@@ -2709,7 +2709,7 @@
                 <w:sz w:val="20"/>
                 <w:szCs w:val="20"/>
               </w:rPr>
-              <w:t xml:space="preserve">2015-2016 *</w:t>
+              <w:t xml:space="preserve">2015-2016</w:t>
             </w:r>
           </w:p>
         </w:tc>
@@ -2733,7 +2733,7 @@
                 <w:sz w:val="20"/>
                 <w:szCs w:val="20"/>
               </w:rPr>
-              <w:t xml:space="preserve">4.969,8</w:t>
+              <w:t xml:space="preserve">5.771,0</w:t>
             </w:r>
           </w:p>
         </w:tc>
@@ -2757,7 +2757,7 @@
                 <w:sz w:val="20"/>
                 <w:szCs w:val="20"/>
               </w:rPr>
-              <w:t xml:space="preserve">4.969,8</w:t>
+              <w:t xml:space="preserve">5.771,0</w:t>
             </w:r>
           </w:p>
         </w:tc>
@@ -2781,7 +2781,7 @@
                 <w:sz w:val="20"/>
                 <w:szCs w:val="20"/>
               </w:rPr>
-              <w:t xml:space="preserve">estimado</w:t>
+              <w:t xml:space="preserve">medido</w:t>
             </w:r>
           </w:p>
         </w:tc>
@@ -3565,7 +3565,7 @@
           <w:sz w:val="22"/>
           <w:szCs w:val="22"/>
         </w:rPr>
-        <w:t xml:space="preserve">* Periodos estimados/calibrados: 2010-2012, 2015-2016, 2018-2019 y 2023-2024. Véase la sección 12.</w:t>
+        <w:t xml:space="preserve">* Periodos estimados/calibrados: 2010-2012, 2018-2019 y 2023-2024. Véase la sección 12. El pico de 2015-2016 es dato medido, recuperado de la tabla de atributos municipal oficial.</w:t>
       </w:r>
     </w:p>
     <w:p>
@@ -3587,7 +3587,7 @@
           <w:sz w:val="22"/>
           <w:szCs w:val="22"/>
         </w:rPr>
-        <w:t xml:space="preserve">Tras un máximo histórico en 2002-2004 y un repunte marcado en 2015-2016 (4.970 ha, coincidiendo con el periodo posterior a los acuerdos de paz), la deforestación anual muestra una tendencia general a la baja en los años más recientes, con el mínimo en 2020-2021. No obstante, la presión no desaparece: se desplaza hacia nuevas zonas (véanse las secciones 8 a 11).</w:t>
+        <w:t xml:space="preserve">Tras un primer repunte en 2002-2004, el máximo histórico de la serie se registró en 2015-2016 (5.771 ha, coincidiendo con el periodo posterior a los acuerdos de paz). A partir de ahí la deforestación anual muestra una tendencia general a la baja en los años más recientes, con el mínimo en 2020-2021. No obstante, la presión no desaparece: se desplaza hacia nuevas zonas (véanse las secciones 8 a 11).</w:t>
       </w:r>
     </w:p>
     <w:p>
@@ -3854,7 +3854,7 @@
                 <w:sz w:val="20"/>
                 <w:szCs w:val="20"/>
               </w:rPr>
-              <w:t xml:space="preserve">12.830,4</w:t>
+              <w:t xml:space="preserve">13.308,9</w:t>
             </w:r>
           </w:p>
         </w:tc>
@@ -3952,7 +3952,7 @@
                 <w:sz w:val="20"/>
                 <w:szCs w:val="20"/>
               </w:rPr>
-              <w:t xml:space="preserve">5.431,3</w:t>
+              <w:t xml:space="preserve">5.759,4</w:t>
             </w:r>
           </w:p>
         </w:tc>
@@ -4046,7 +4046,7 @@
                 <w:sz w:val="20"/>
                 <w:szCs w:val="20"/>
               </w:rPr>
-              <w:t xml:space="preserve">4.929,0</w:t>
+              <w:t xml:space="preserve">5.003,3</w:t>
             </w:r>
           </w:p>
         </w:tc>
@@ -4144,7 +4144,7 @@
                 <w:sz w:val="20"/>
                 <w:szCs w:val="20"/>
               </w:rPr>
-              <w:t xml:space="preserve">4.918,9</w:t>
+              <w:t xml:space="preserve">4.720,1</w:t>
             </w:r>
           </w:p>
         </w:tc>
@@ -4238,7 +4238,7 @@
                 <w:sz w:val="20"/>
                 <w:szCs w:val="20"/>
               </w:rPr>
-              <w:t xml:space="preserve">2.884,7</w:t>
+              <w:t xml:space="preserve">3.058,7</w:t>
             </w:r>
           </w:p>
         </w:tc>
@@ -4336,7 +4336,7 @@
                 <w:sz w:val="20"/>
                 <w:szCs w:val="20"/>
               </w:rPr>
-              <w:t xml:space="preserve">2.403,9</w:t>
+              <w:t xml:space="preserve">2.350,8</w:t>
             </w:r>
           </w:p>
         </w:tc>
@@ -4384,7 +4384,7 @@
                 <w:sz w:val="20"/>
                 <w:szCs w:val="20"/>
               </w:rPr>
-              <w:t xml:space="preserve">Murindó</w:t>
+              <w:t xml:space="preserve">Apartadó</w:t>
             </w:r>
           </w:p>
         </w:tc>
@@ -4407,7 +4407,7 @@
                 <w:sz w:val="20"/>
                 <w:szCs w:val="20"/>
               </w:rPr>
-              <w:t xml:space="preserve">Atrato</w:t>
+              <w:t xml:space="preserve">Centro</w:t>
             </w:r>
           </w:p>
         </w:tc>
@@ -4430,7 +4430,7 @@
                 <w:sz w:val="20"/>
                 <w:szCs w:val="20"/>
               </w:rPr>
-              <w:t xml:space="preserve">2.233,9</w:t>
+              <w:t xml:space="preserve">2.271,6</w:t>
             </w:r>
           </w:p>
         </w:tc>
@@ -4480,7 +4480,7 @@
                 <w:sz w:val="20"/>
                 <w:szCs w:val="20"/>
               </w:rPr>
-              <w:t xml:space="preserve">Apartadó</w:t>
+              <w:t xml:space="preserve">Murindó</w:t>
             </w:r>
           </w:p>
         </w:tc>
@@ -4504,7 +4504,7 @@
                 <w:sz w:val="20"/>
                 <w:szCs w:val="20"/>
               </w:rPr>
-              <w:t xml:space="preserve">Centro</w:t>
+              <w:t xml:space="preserve">Atrato</w:t>
             </w:r>
           </w:p>
         </w:tc>
@@ -4528,7 +4528,7 @@
                 <w:sz w:val="20"/>
                 <w:szCs w:val="20"/>
               </w:rPr>
-              <w:t xml:space="preserve">2.212,2</w:t>
+              <w:t xml:space="preserve">2.200,6</w:t>
             </w:r>
           </w:p>
         </w:tc>
@@ -4622,7 +4622,7 @@
                 <w:sz w:val="20"/>
                 <w:szCs w:val="20"/>
               </w:rPr>
-              <w:t xml:space="preserve">2.110,0</w:t>
+              <w:t xml:space="preserve">2.110,8</w:t>
             </w:r>
           </w:p>
         </w:tc>
@@ -4720,7 +4720,7 @@
                 <w:sz w:val="20"/>
                 <w:szCs w:val="20"/>
               </w:rPr>
-              <w:t xml:space="preserve">2.026,8</w:t>
+              <w:t xml:space="preserve">2.026,1</w:t>
             </w:r>
           </w:p>
         </w:tc>
@@ -4814,7 +4814,7 @@
                 <w:sz w:val="20"/>
                 <w:szCs w:val="20"/>
               </w:rPr>
-              <w:t xml:space="preserve">1.175,7</w:t>
+              <w:t xml:space="preserve">1.168,8</w:t>
             </w:r>
           </w:p>
         </w:tc>
@@ -5006,7 +5006,7 @@
                 <w:sz w:val="20"/>
                 <w:szCs w:val="20"/>
               </w:rPr>
-              <w:t xml:space="preserve">537,4</w:t>
+              <w:t xml:space="preserve">537,1</w:t>
             </w:r>
           </w:p>
         </w:tc>
@@ -5198,7 +5198,7 @@
                 <w:sz w:val="20"/>
                 <w:szCs w:val="20"/>
               </w:rPr>
-              <w:t xml:space="preserve">401,4</w:t>
+              <w:t xml:space="preserve">401,2</w:t>
             </w:r>
           </w:p>
         </w:tc>
@@ -5390,7 +5390,7 @@
                 <w:sz w:val="20"/>
                 <w:szCs w:val="20"/>
               </w:rPr>
-              <w:t xml:space="preserve">218,2</w:t>
+              <w:t xml:space="preserve">197,3</w:t>
             </w:r>
           </w:p>
         </w:tc>
@@ -5614,7 +5614,7 @@
           <w:sz w:val="22"/>
           <w:szCs w:val="22"/>
         </w:rPr>
-        <w:t xml:space="preserve">) concentran 30.994 ha, es decir el </w:t>
+        <w:t xml:space="preserve">) concentran 31.850 ha, es decir el </w:t>
       </w:r>
       <w:r>
         <w:rPr>
@@ -5623,7 +5623,7 @@
           <w:sz w:val="22"/>
           <w:szCs w:val="22"/>
         </w:rPr>
-        <w:t xml:space="preserve">67,3 %</w:t>
+        <w:t xml:space="preserve">68,0 %</w:t>
       </w:r>
       <w:r>
         <w:rPr>
@@ -5809,7 +5809,7 @@
                 <w:sz w:val="20"/>
                 <w:szCs w:val="20"/>
               </w:rPr>
-              <w:t xml:space="preserve">24.098,2</w:t>
+              <w:t xml:space="preserve">24.437,6</w:t>
             </w:r>
           </w:p>
         </w:tc>
@@ -5832,7 +5832,7 @@
                 <w:sz w:val="20"/>
                 <w:szCs w:val="20"/>
               </w:rPr>
-              <w:t xml:space="preserve">52,3 %</w:t>
+              <w:t xml:space="preserve">52,2 %</w:t>
             </w:r>
           </w:p>
         </w:tc>
@@ -5882,7 +5882,7 @@
                 <w:sz w:val="20"/>
                 <w:szCs w:val="20"/>
               </w:rPr>
-              <w:t xml:space="preserve">9.883,8</w:t>
+              <w:t xml:space="preserve">10.132,0</w:t>
             </w:r>
           </w:p>
         </w:tc>
@@ -5906,7 +5906,7 @@
                 <w:sz w:val="20"/>
                 <w:szCs w:val="20"/>
               </w:rPr>
-              <w:t xml:space="preserve">21,5 %</w:t>
+              <w:t xml:space="preserve">21,6 %</w:t>
             </w:r>
           </w:p>
         </w:tc>
@@ -5954,7 +5954,7 @@
                 <w:sz w:val="20"/>
                 <w:szCs w:val="20"/>
               </w:rPr>
-              <w:t xml:space="preserve">5.431,3</w:t>
+              <w:t xml:space="preserve">5.759,4</w:t>
             </w:r>
           </w:p>
         </w:tc>
@@ -5977,7 +5977,7 @@
                 <w:sz w:val="20"/>
                 <w:szCs w:val="20"/>
               </w:rPr>
-              <w:t xml:space="preserve">11,8 %</w:t>
+              <w:t xml:space="preserve">12,3 %</w:t>
             </w:r>
           </w:p>
         </w:tc>
@@ -6027,7 +6027,7 @@
                 <w:sz w:val="20"/>
                 <w:szCs w:val="20"/>
               </w:rPr>
-              <w:t xml:space="preserve">3.409,5</w:t>
+              <w:t xml:space="preserve">3.369,4</w:t>
             </w:r>
           </w:p>
         </w:tc>
@@ -6051,7 +6051,7 @@
                 <w:sz w:val="20"/>
                 <w:szCs w:val="20"/>
               </w:rPr>
-              <w:t xml:space="preserve">7,4 %</w:t>
+              <w:t xml:space="preserve">7,2 %</w:t>
             </w:r>
           </w:p>
         </w:tc>
@@ -6099,7 +6099,7 @@
                 <w:sz w:val="20"/>
                 <w:szCs w:val="20"/>
               </w:rPr>
-              <w:t xml:space="preserve">3.221,4</w:t>
+              <w:t xml:space="preserve">3.147,1</w:t>
             </w:r>
           </w:p>
         </w:tc>
@@ -6122,7 +6122,7 @@
                 <w:sz w:val="20"/>
                 <w:szCs w:val="20"/>
               </w:rPr>
-              <w:t xml:space="preserve">7,0 %</w:t>
+              <w:t xml:space="preserve">6,7 %</w:t>
             </w:r>
           </w:p>
         </w:tc>
@@ -9294,7 +9294,7 @@
           <w:sz w:val="22"/>
           <w:szCs w:val="22"/>
         </w:rPr>
-        <w:t xml:space="preserve">El análisis es transparente respecto a sus límites. Cuatro periodos no cuentan con medición municipal directa en el paquete recibido y sus cifras son estimadas o calibradas:</w:t>
+        <w:t xml:space="preserve">El análisis es transparente respecto a sus límites. Tras una revisión archivo por archivo, el periodo pico 2015-2016 se recuperó como dato medido: aunque su geometría (.shp) se perdió, sobrevivió la tabla de atributos municipal oficial (Defor2015_2016_Mpios_Proj_Correg.dbf) con el área real por municipio y clase de los 19 municipios, de modo que su cifra dejó de ser una estimación. Solo tres periodos siguen sin medición municipal directa y sus cifras son estimadas o calibradas:</w:t>
       </w:r>
     </w:p>
     <w:p>
@@ -9339,14 +9339,14 @@
           <w:sz w:val="22"/>
           <w:szCs w:val="22"/>
         </w:rPr>
-        <w:t xml:space="preserve">2015-2016: </w:t>
-      </w:r>
-      <w:r>
-        <w:rPr>
-          <w:sz w:val="22"/>
-          <w:szCs w:val="22"/>
-        </w:rPr>
-        <w:t xml:space="preserve">Solo existe el cruce con cuencas (cobertura parcial de la jurisdicción). Se calibra con factores municipio-clase derivados de 2016-2017, único periodo con ambas fuentes.</w:t>
+        <w:t xml:space="preserve">2018-2019: </w:t>
+      </w:r>
+      <w:r>
+        <w:rPr>
+          <w:sz w:val="22"/>
+          <w:szCs w:val="22"/>
+        </w:rPr>
+        <w:t xml:space="preserve">La carpeta del periodo no existe en el paquete. Se estima por interpolación de la tasa anual entre periodos vecinos.</w:t>
       </w:r>
     </w:p>
     <w:p>
@@ -9365,14 +9365,35 @@
           <w:sz w:val="22"/>
           <w:szCs w:val="22"/>
         </w:rPr>
-        <w:t xml:space="preserve">2018-2019: </w:t>
-      </w:r>
-      <w:r>
-        <w:rPr>
-          <w:sz w:val="22"/>
-          <w:szCs w:val="22"/>
-        </w:rPr>
-        <w:t xml:space="preserve">La carpeta del periodo no existe en el paquete. Se estima por interpolación de la tasa anual entre periodos vecinos.</w:t>
+        <w:t xml:space="preserve">2023-2024: </w:t>
+      </w:r>
+      <w:r>
+        <w:rPr>
+          <w:sz w:val="22"/>
+          <w:szCs w:val="22"/>
+        </w:rPr>
+        <w:t xml:space="preserve">El shapefile municipal se perdió y las tablas de atributos que sobreviven (cuencas, áreas protegidas, consejos) no traen columna de área municipal. Se estima por tendencia.</w:t>
+      </w:r>
+    </w:p>
+    <w:p>
+      <w:pPr>
+        <w:pStyle w:val="Heading2"/>
+      </w:pPr>
+      <w:r>
+        <w:t xml:space="preserve">12.1. Cómo obtener los datos reales</w:t>
+      </w:r>
+    </w:p>
+    <w:p>
+      <w:pPr>
+        <w:spacing w:after="120" w:line="276"/>
+        <w:jc w:val="both"/>
+      </w:pPr>
+      <w:r>
+        <w:rPr>
+          <w:sz w:val="22"/>
+          <w:szCs w:val="22"/>
+        </w:rPr>
+        <w:t xml:space="preserve">Los tres periodos restantes NO son recuperables a partir del paquete actual (se verificó archivo por archivo). Para reemplazar las estimaciones por cifras oficiales existen tres vías:</w:t>
       </w:r>
     </w:p>
     <w:p>
@@ -9391,35 +9412,14 @@
           <w:sz w:val="22"/>
           <w:szCs w:val="22"/>
         </w:rPr>
-        <w:t xml:space="preserve">2023-2024: </w:t>
-      </w:r>
-      <w:r>
-        <w:rPr>
-          <w:sz w:val="22"/>
-          <w:szCs w:val="22"/>
-        </w:rPr>
-        <w:t xml:space="preserve">El shapefile municipal se perdió (solo sobreviven tablas de atributos sin geometría ni columna de área). Se estima por tendencia.</w:t>
-      </w:r>
-    </w:p>
-    <w:p>
-      <w:pPr>
-        <w:pStyle w:val="Heading2"/>
-      </w:pPr>
-      <w:r>
-        <w:t xml:space="preserve">12.1. Cómo obtener los datos reales</w:t>
-      </w:r>
-    </w:p>
-    <w:p>
-      <w:pPr>
-        <w:spacing w:after="120" w:line="276"/>
-        <w:jc w:val="both"/>
-      </w:pPr>
-      <w:r>
-        <w:rPr>
-          <w:sz w:val="22"/>
-          <w:szCs w:val="22"/>
-        </w:rPr>
-        <w:t xml:space="preserve">Estos periodos NO son recuperables a partir del paquete actual (se verificó archivo por archivo). Para reemplazar las estimaciones por cifras oficiales existen tres vías:</w:t>
+        <w:t xml:space="preserve">CORPOURABA (recomendada). </w:t>
+      </w:r>
+      <w:r>
+        <w:rPr>
+          <w:sz w:val="22"/>
+          <w:szCs w:val="22"/>
+        </w:rPr>
+        <w:t xml:space="preserve">Solicitar a la Corporación los shapefiles municipales completos de 2010-2012, 2018-2019 y 2023-2024. La Corporación los generó en su momento; simplemente no quedaron en esta descarga o llegaron corruptos.</w:t>
       </w:r>
     </w:p>
     <w:p>
@@ -9438,14 +9438,14 @@
           <w:sz w:val="22"/>
           <w:szCs w:val="22"/>
         </w:rPr>
-        <w:t xml:space="preserve">CORPOURABA (recomendada). </w:t>
-      </w:r>
-      <w:r>
-        <w:rPr>
-          <w:sz w:val="22"/>
-          <w:szCs w:val="22"/>
-        </w:rPr>
-        <w:t xml:space="preserve">Solicitar a la Corporación los shapefiles municipales completos de 2010-2012, 2018-2019 y 2023-2024, y el shapefile municipal de 2015-2016. La Corporación los generó en su momento; simplemente no quedaron en esta descarga o llegaron corruptos.</w:t>
+        <w:t xml:space="preserve">IDEAM — SMByC. </w:t>
+      </w:r>
+      <w:r>
+        <w:rPr>
+          <w:sz w:val="22"/>
+          <w:szCs w:val="22"/>
+        </w:rPr>
+        <w:t xml:space="preserve">El Sistema de Monitoreo de Bosques y Carbono publica la deforestación anual nacional a nivel municipal (portal smbyc.ideam.gov.co y datos abiertos). Es la fuente autoritativa nacional de la que se deriva el monitoreo regional; permite reconstruir todos los años faltantes.</w:t>
       </w:r>
     </w:p>
     <w:p>
@@ -9464,14 +9464,72 @@
           <w:sz w:val="22"/>
           <w:szCs w:val="22"/>
         </w:rPr>
-        <w:t xml:space="preserve">IDEAM — SMByC. </w:t>
-      </w:r>
-      <w:r>
-        <w:rPr>
-          <w:sz w:val="22"/>
-          <w:szCs w:val="22"/>
-        </w:rPr>
-        <w:t xml:space="preserve">El Sistema de Monitoreo de Bosques y Carbono publica la deforestación anual nacional a nivel municipal (portal smbyc.ideam.gov.co y datos abiertos). Es la fuente autoritativa nacional de la que se deriva el monitoreo regional; permite reconstruir todos los años faltantes.</w:t>
+        <w:t xml:space="preserve">Reconstrucción parcial 2023-2024. </w:t>
+      </w:r>
+      <w:r>
+        <w:rPr>
+          <w:sz w:val="22"/>
+          <w:szCs w:val="22"/>
+        </w:rPr>
+        <w:t xml:space="preserve">Las tablas de atributos que sobrevivieron (cuencas, áreas protegidas y consejos) permiten un conteo parcial por municipio, aunque sin hectáreas fiables; serviría solo como referencia mínima.</w:t>
+      </w:r>
+    </w:p>
+    <w:p>
+      <w:pPr>
+        <w:spacing w:after="120" w:line="276"/>
+        <w:jc w:val="both"/>
+      </w:pPr>
+      <w:r>
+        <w:rPr>
+          <w:b/>
+          <w:bCs/>
+          <w:sz w:val="22"/>
+          <w:szCs w:val="22"/>
+        </w:rPr>
+        <w:t xml:space="preserve">Integración inmediata. </w:t>
+      </w:r>
+      <w:r>
+        <w:rPr>
+          <w:sz w:val="22"/>
+          <w:szCs w:val="22"/>
+        </w:rPr>
+        <w:t xml:space="preserve">La plataforma está diseñada para incorporar estos datos sin reprogramación: basta colocar los archivos en la carpeta del periodo correspondiente y volver a ejecutar el ETL (</w:t>
+      </w:r>
+      <w:r>
+        <w:rPr>
+          <w:rFonts w:ascii="Consolas" w:cs="Consolas" w:eastAsia="Consolas" w:hAnsi="Consolas"/>
+          <w:sz w:val="20"/>
+          <w:szCs w:val="20"/>
+        </w:rPr>
+        <w:t xml:space="preserve">python etl/run_etl.py</w:t>
+      </w:r>
+      <w:r>
+        <w:rPr>
+          <w:sz w:val="22"/>
+          <w:szCs w:val="22"/>
+        </w:rPr>
+        <w:t xml:space="preserve">). El sistema los detecta, reemplaza las estimaciones por las mediciones reales y actualiza automáticamente el mapa, el tablero y las descargas.</w:t>
+      </w:r>
+    </w:p>
+    <w:p>
+      <w:pPr>
+        <w:pStyle w:val="Heading1"/>
+      </w:pPr>
+      <w:r>
+        <w:t xml:space="preserve">13. Hallazgos clave</w:t>
+      </w:r>
+    </w:p>
+    <w:p>
+      <w:pPr>
+        <w:spacing w:after="120" w:line="276"/>
+        <w:jc w:val="both"/>
+      </w:pPr>
+      <w:r>
+        <w:rPr>
+          <w:sz w:val="22"/>
+          <w:szCs w:val="22"/>
+        </w:rPr>
+        <w:t xml:space="preserve">Síntesis de los hallazgos verificados de la investigación, ordenados por relevancia:</w:t>
       </w:r>
     </w:p>
     <w:p>
@@ -9490,72 +9548,21 @@
           <w:sz w:val="22"/>
           <w:szCs w:val="22"/>
         </w:rPr>
-        <w:t xml:space="preserve">Reconstrucción parcial 2023-2024. </w:t>
-      </w:r>
-      <w:r>
-        <w:rPr>
-          <w:sz w:val="22"/>
-          <w:szCs w:val="22"/>
-        </w:rPr>
-        <w:t xml:space="preserve">Las tablas de atributos que sobrevivieron (cuencas, áreas protegidas y consejos) permiten un conteo parcial por municipio, aunque sin hectáreas fiables; serviría solo como referencia mínima.</w:t>
-      </w:r>
-    </w:p>
-    <w:p>
-      <w:pPr>
-        <w:spacing w:after="120" w:line="276"/>
-        <w:jc w:val="both"/>
-      </w:pPr>
-      <w:r>
-        <w:rPr>
-          <w:b/>
-          <w:bCs/>
-          <w:sz w:val="22"/>
-          <w:szCs w:val="22"/>
-        </w:rPr>
-        <w:t xml:space="preserve">Integración inmediata. </w:t>
-      </w:r>
-      <w:r>
-        <w:rPr>
-          <w:sz w:val="22"/>
-          <w:szCs w:val="22"/>
-        </w:rPr>
-        <w:t xml:space="preserve">La plataforma está diseñada para incorporar estos datos sin reprogramación: basta colocar los archivos en la carpeta del periodo correspondiente y volver a ejecutar el ETL (</w:t>
-      </w:r>
-      <w:r>
-        <w:rPr>
-          <w:rFonts w:ascii="Consolas" w:cs="Consolas" w:eastAsia="Consolas" w:hAnsi="Consolas"/>
-          <w:sz w:val="20"/>
-          <w:szCs w:val="20"/>
-        </w:rPr>
-        <w:t xml:space="preserve">python etl/run_etl.py</w:t>
-      </w:r>
-      <w:r>
-        <w:rPr>
-          <w:sz w:val="22"/>
-          <w:szCs w:val="22"/>
-        </w:rPr>
-        <w:t xml:space="preserve">). El sistema los detecta, reemplaza las estimaciones por las mediciones reales y actualiza automáticamente el mapa, el tablero y las descargas.</w:t>
-      </w:r>
-    </w:p>
-    <w:p>
-      <w:pPr>
-        <w:pStyle w:val="Heading1"/>
-      </w:pPr>
-      <w:r>
-        <w:t xml:space="preserve">13. Hallazgos clave</w:t>
-      </w:r>
-    </w:p>
-    <w:p>
-      <w:pPr>
-        <w:spacing w:after="120" w:line="276"/>
-        <w:jc w:val="both"/>
-      </w:pPr>
-      <w:r>
-        <w:rPr>
-          <w:sz w:val="22"/>
-          <w:szCs w:val="22"/>
-        </w:rPr>
-        <w:t xml:space="preserve">Síntesis de los hallazgos verificados de la investigación, ordenados por relevancia:</w:t>
+        <w:t xml:space="preserve">La deforestación se desplaza hacia territorios étnicos </w:t>
+      </w:r>
+      <w:r>
+        <w:rPr>
+          <w:sz w:val="22"/>
+          <w:szCs w:val="22"/>
+        </w:rPr>
+        <w:t xml:space="preserve">(40,9 % de la deforestación mapeada, 2019-2023). </w:t>
+      </w:r>
+      <w:r>
+        <w:rPr>
+          <w:sz w:val="22"/>
+          <w:szCs w:val="22"/>
+        </w:rPr>
+        <w:t xml:space="preserve">En 2002-2010 los resguardos indígenas y consejos comunitarios concentraban el 16,4% de la deforestación mapeada; en 2019-2023 concentran el 40,9%. La presión se movió hacia los territorios colectivos mientras el resto de la jurisdicción desacelera.</w:t>
       </w:r>
     </w:p>
     <w:p>
@@ -9574,21 +9581,21 @@
           <w:sz w:val="22"/>
           <w:szCs w:val="22"/>
         </w:rPr>
-        <w:t xml:space="preserve">La deforestación se desplaza hacia territorios étnicos </w:t>
-      </w:r>
-      <w:r>
-        <w:rPr>
-          <w:sz w:val="22"/>
-          <w:szCs w:val="22"/>
-        </w:rPr>
-        <w:t xml:space="preserve">(40,9 % de la deforestación mapeada, 2019-2023). </w:t>
-      </w:r>
-      <w:r>
-        <w:rPr>
-          <w:sz w:val="22"/>
-          <w:szCs w:val="22"/>
-        </w:rPr>
-        <w:t xml:space="preserve">En 2002-2010 los resguardos indígenas y consejos comunitarios concentraban el 16,4% de la deforestación mapeada; en 2019-2023 concentran el 40,9%. La presión se movió hacia los territorios colectivos mientras el resto de la jurisdicción desacelera.</w:t>
+        <w:t xml:space="preserve">La jurisdicción perdió 37.809 ha de bosque estable </w:t>
+      </w:r>
+      <w:r>
+        <w:rPr>
+          <w:sz w:val="22"/>
+          <w:szCs w:val="22"/>
+        </w:rPr>
+        <w:t xml:space="preserve">(37.809 ha (2000-2002 → 2022-2023), 2000-2023). </w:t>
+      </w:r>
+      <w:r>
+        <w:rPr>
+          <w:sz w:val="22"/>
+          <w:szCs w:val="22"/>
+        </w:rPr>
+        <w:t xml:space="preserve">El bosque estable pasó de 908.114 ha a 870.305 ha entre los periodos 2000-2002 y 2022-2023: una pérdida neta del 4,2% del bosque de la jurisdicción, medida con las mismas fuentes municipales en ambos extremos.</w:t>
       </w:r>
     </w:p>
     <w:p>
@@ -9607,21 +9614,21 @@
           <w:sz w:val="22"/>
           <w:szCs w:val="22"/>
         </w:rPr>
-        <w:t xml:space="preserve">La jurisdicción perdió 37.809 ha de bosque estable </w:t>
-      </w:r>
-      <w:r>
-        <w:rPr>
-          <w:sz w:val="22"/>
-          <w:szCs w:val="22"/>
-        </w:rPr>
-        <w:t xml:space="preserve">(37.809 ha (2000-2002 → 2022-2023), 2000-2023). </w:t>
-      </w:r>
-      <w:r>
-        <w:rPr>
-          <w:sz w:val="22"/>
-          <w:szCs w:val="22"/>
-        </w:rPr>
-        <w:t xml:space="preserve">El bosque estable pasó de 908.114 ha a 870.305 ha entre los periodos 2000-2002 y 2022-2023: una pérdida neta del 4,2% del bosque de la jurisdicción, medida con las mismas fuentes municipales en ambos extremos.</w:t>
+        <w:t xml:space="preserve">72% de la pérdida ocurre en frentes persistentes </w:t>
+      </w:r>
+      <w:r>
+        <w:rPr>
+          <w:sz w:val="22"/>
+          <w:szCs w:val="22"/>
+        </w:rPr>
+        <w:t xml:space="preserve">(72,2 % de ha en celdas recurrentes, 2002-2023). </w:t>
+      </w:r>
+      <w:r>
+        <w:rPr>
+          <w:sz w:val="22"/>
+          <w:szCs w:val="22"/>
+        </w:rPr>
+        <w:t xml:space="preserve">1.039 celdas de 2×2 km registran deforestación en 3 o más periodos y concentran el 72,2% de las hectáreas deforestadas mapeadas. No son eventos dispersos: son frentes activos y localizables, priorizables para control.</w:t>
       </w:r>
     </w:p>
     <w:p>
@@ -9640,21 +9647,21 @@
           <w:sz w:val="22"/>
           <w:szCs w:val="22"/>
         </w:rPr>
-        <w:t xml:space="preserve">72% de la pérdida ocurre en frentes persistentes </w:t>
-      </w:r>
-      <w:r>
-        <w:rPr>
-          <w:sz w:val="22"/>
-          <w:szCs w:val="22"/>
-        </w:rPr>
-        <w:t xml:space="preserve">(72,2 % de ha en celdas recurrentes, 2002-2023). </w:t>
-      </w:r>
-      <w:r>
-        <w:rPr>
-          <w:sz w:val="22"/>
-          <w:szCs w:val="22"/>
-        </w:rPr>
-        <w:t xml:space="preserve">1.039 celdas de 2×2 km registran deforestación en 3 o más periodos y concentran el 72,2% de las hectáreas deforestadas mapeadas. No son eventos dispersos: son frentes activos y localizables, priorizables para control.</w:t>
+        <w:t xml:space="preserve">Turbo pierde más bosque; Carepa, la mayor fracción </w:t>
+      </w:r>
+      <w:r>
+        <w:rPr>
+          <w:sz w:val="22"/>
+          <w:szCs w:val="22"/>
+        </w:rPr>
+        <w:t xml:space="preserve">(18.424 ha de bosque perdidas (Turbo), 2000-2023). </w:t>
+      </w:r>
+      <w:r>
+        <w:rPr>
+          <w:sz w:val="22"/>
+          <w:szCs w:val="22"/>
+        </w:rPr>
+        <w:t xml:space="preserve">Turbo perdió 18.424 ha de bosque estable (-24,6% de su bosque de 2000). En proporción, Carepa es el caso más crítico: conserva solo el 56,8% de su bosque inicial (-43,2%). Necoclí (-23,8%) y Chigorodó (-12,6%) completan el cuadro del eje bananero.</w:t>
       </w:r>
     </w:p>
     <w:p>
@@ -9673,21 +9680,21 @@
           <w:sz w:val="22"/>
           <w:szCs w:val="22"/>
         </w:rPr>
-        <w:t xml:space="preserve">Turbo pierde más bosque; Carepa, la mayor fracción </w:t>
-      </w:r>
-      <w:r>
-        <w:rPr>
-          <w:sz w:val="22"/>
-          <w:szCs w:val="22"/>
-        </w:rPr>
-        <w:t xml:space="preserve">(18.424 ha de bosque perdidas (Turbo), 2000-2023). </w:t>
-      </w:r>
-      <w:r>
-        <w:rPr>
-          <w:sz w:val="22"/>
-          <w:szCs w:val="22"/>
-        </w:rPr>
-        <w:t xml:space="preserve">Turbo perdió 18.424 ha de bosque estable (-24,6% de su bosque de 2000). En proporción, Carepa es el caso más crítico: conserva solo el 56,8% de su bosque inicial (-43,2%). Necoclí (-23,8%) y Chigorodó (-12,6%) completan el cuadro del eje bananero.</w:t>
+        <w:t xml:space="preserve">3.362 ha deforestadas dentro de áreas protegidas </w:t>
+      </w:r>
+      <w:r>
+        <w:rPr>
+          <w:sz w:val="22"/>
+          <w:szCs w:val="22"/>
+        </w:rPr>
+        <w:t xml:space="preserve">(3.362 ha (12,6% de lo mapeado), 2002-2023). </w:t>
+      </w:r>
+      <w:r>
+        <w:rPr>
+          <w:sz w:val="22"/>
+          <w:szCs w:val="22"/>
+        </w:rPr>
+        <w:t xml:space="preserve">En los 10 periodos comparables, el 12,6% de la deforestación mapeada ocurrió dentro de áreas protegidas. El DRMI Serranía de Abibe concentra 1.903 ha (57% del total en AP), con pico de 585 ha en 2015-2016; le siguen la RFPN Carauta (514 ha) y el PNN Las Orquídeas (334 ha).</w:t>
       </w:r>
     </w:p>
     <w:p>
@@ -9706,21 +9713,21 @@
           <w:sz w:val="22"/>
           <w:szCs w:val="22"/>
         </w:rPr>
-        <w:t xml:space="preserve">3.362 ha deforestadas dentro de áreas protegidas </w:t>
-      </w:r>
-      <w:r>
-        <w:rPr>
-          <w:sz w:val="22"/>
-          <w:szCs w:val="22"/>
-        </w:rPr>
-        <w:t xml:space="preserve">(3.362 ha (12,6% de lo mapeado), 2002-2023). </w:t>
-      </w:r>
-      <w:r>
-        <w:rPr>
-          <w:sz w:val="22"/>
-          <w:szCs w:val="22"/>
-        </w:rPr>
-        <w:t xml:space="preserve">En los 10 periodos comparables, el 12,6% de la deforestación mapeada ocurrió dentro de áreas protegidas. El DRMI Serranía de Abibe concentra 1.903 ha (57% del total en AP), con pico de 585 ha en 2015-2016; le siguen la RFPN Carauta (514 ha) y el PNN Las Orquídeas (334 ha).</w:t>
+        <w:t xml:space="preserve">La regeneración solo compensa el 2% de la pérdida </w:t>
+      </w:r>
+      <w:r>
+        <w:rPr>
+          <w:sz w:val="22"/>
+          <w:szCs w:val="22"/>
+        </w:rPr>
+        <w:t xml:space="preserve">(2,1 % de la deforestación medida, 2000-2023). </w:t>
+      </w:r>
+      <w:r>
+        <w:rPr>
+          <w:sz w:val="22"/>
+          <w:szCs w:val="22"/>
+        </w:rPr>
+        <w:t xml:space="preserve">En los periodos con medición directa se regeneraron 726 ha frente a 34.542 ha deforestadas: una relación de 1 a 48. Arboletes (18,8%) y Urrao (9,6%) son los únicos municipios donde la regeneración supera el 5% de su pérdida.</w:t>
       </w:r>
     </w:p>
     <w:p>
@@ -9739,21 +9746,21 @@
           <w:sz w:val="22"/>
           <w:szCs w:val="22"/>
         </w:rPr>
-        <w:t xml:space="preserve">La regeneración solo compensa el 2% de la pérdida </w:t>
-      </w:r>
-      <w:r>
-        <w:rPr>
-          <w:sz w:val="22"/>
-          <w:szCs w:val="22"/>
-        </w:rPr>
-        <w:t xml:space="preserve">(2,1 % de la deforestación medida, 2000-2023). </w:t>
-      </w:r>
-      <w:r>
-        <w:rPr>
-          <w:sz w:val="22"/>
-          <w:szCs w:val="22"/>
-        </w:rPr>
-        <w:t xml:space="preserve">En los periodos con medición directa se regeneraron 726 ha frente a 34.542 ha deforestadas: una relación de 1 a 48. Arboletes (18,8%) y Urrao (9,6%) son los únicos municipios donde la regeneración supera el 5% de su pérdida.</w:t>
+        <w:t xml:space="preserve">La cuenca del río León es la más golpeada </w:t>
+      </w:r>
+      <w:r>
+        <w:rPr>
+          <w:sz w:val="22"/>
+          <w:szCs w:val="22"/>
+        </w:rPr>
+        <w:t xml:space="preserve">(6.333 ha deforestadas, 2000-2023). </w:t>
+      </w:r>
+      <w:r>
+        <w:rPr>
+          <w:sz w:val="22"/>
+          <w:szCs w:val="22"/>
+        </w:rPr>
+        <w:t xml:space="preserve">De las 7 cuencas monitoreadas (39% de la jurisdicción), la del río León acumula 6.333 ha deforestadas (2,9% de su superficie) con tendencia a empeorar. Le sigue Turbo-Currulao con 2.604 ha. Son cuencas abastecedoras del eje bananero.</w:t>
       </w:r>
     </w:p>
     <w:p>
@@ -9772,21 +9779,21 @@
           <w:sz w:val="22"/>
           <w:szCs w:val="22"/>
         </w:rPr>
-        <w:t xml:space="preserve">La cuenca del río León es la más golpeada </w:t>
-      </w:r>
-      <w:r>
-        <w:rPr>
-          <w:sz w:val="22"/>
-          <w:szCs w:val="22"/>
-        </w:rPr>
-        <w:t xml:space="preserve">(6.333 ha deforestadas, 2000-2023). </w:t>
-      </w:r>
-      <w:r>
-        <w:rPr>
-          <w:sz w:val="22"/>
-          <w:szCs w:val="22"/>
-        </w:rPr>
-        <w:t xml:space="preserve">De las 7 cuencas monitoreadas (39% de la jurisdicción), la del río León acumula 6.333 ha deforestadas (2,9% de su superficie) con tendencia a empeorar. Le sigue Turbo-Currulao con 2.604 ha. Son cuencas abastecedoras del eje bananero.</w:t>
+        <w:t xml:space="preserve">El pueblo Embera Katío concentra la pérdida en resguardos </w:t>
+      </w:r>
+      <w:r>
+        <w:rPr>
+          <w:sz w:val="22"/>
+          <w:szCs w:val="22"/>
+        </w:rPr>
+        <w:t xml:space="preserve">(3.478 ha (77% de la pérdida en resguardos), 2002-2023). </w:t>
+      </w:r>
+      <w:r>
+        <w:rPr>
+          <w:sz w:val="22"/>
+          <w:szCs w:val="22"/>
+        </w:rPr>
+        <w:t xml:space="preserve">De las 4.513 ha deforestadas en resguardos con medición de área, 3.478 ha corresponden a territorios del pueblo Embera Katío. Los resguardos de Murindó (583 ha), Chaquenodá (558 ha) y Andabú (421 ha) encabezan el ranking.</w:t>
       </w:r>
     </w:p>
     <w:p>
@@ -9805,21 +9812,21 @@
           <w:sz w:val="22"/>
           <w:szCs w:val="22"/>
         </w:rPr>
-        <w:t xml:space="preserve">El pueblo Embera Katío concentra la pérdida en resguardos </w:t>
-      </w:r>
-      <w:r>
-        <w:rPr>
-          <w:sz w:val="22"/>
-          <w:szCs w:val="22"/>
-        </w:rPr>
-        <w:t xml:space="preserve">(3.478 ha (77% de la pérdida en resguardos), 2002-2023). </w:t>
-      </w:r>
-      <w:r>
-        <w:rPr>
-          <w:sz w:val="22"/>
-          <w:szCs w:val="22"/>
-        </w:rPr>
-        <w:t xml:space="preserve">De las 4.513 ha deforestadas en resguardos con medición de área, 3.478 ha corresponden a territorios del pueblo Embera Katío. Los resguardos de Murindó (583 ha), Chaquenodá (558 ha) y Andabú (421 ha) encabezan el ranking.</w:t>
+        <w:t xml:space="preserve">Frentes activos 10 de 12 periodos en Mutatá y Dabeiba </w:t>
+      </w:r>
+      <w:r>
+        <w:rPr>
+          <w:sz w:val="22"/>
+          <w:szCs w:val="22"/>
+        </w:rPr>
+        <w:t xml:space="preserve">(10 periodos con deforestación (máx. observado), 2002-2023). </w:t>
+      </w:r>
+      <w:r>
+        <w:rPr>
+          <w:sz w:val="22"/>
+          <w:szCs w:val="22"/>
+        </w:rPr>
+        <w:t xml:space="preserve">Las celdas más recurrentes de la jurisdicción (piedemonte de Mutatá y Dabeiba, eje de la vía al mar) registran deforestación en 10 de los 12 periodos mapeados, con hasta 127 ha acumuladas por celda de 400 ha. Urrao (179), Turbo (165) y Dabeiba (152) tienen más celdas persistentes.</w:t>
       </w:r>
     </w:p>
     <w:p>
@@ -9838,21 +9845,21 @@
           <w:sz w:val="22"/>
           <w:szCs w:val="22"/>
         </w:rPr>
-        <w:t xml:space="preserve">Frentes activos 10 de 12 periodos en Mutatá y Dabeiba </w:t>
-      </w:r>
-      <w:r>
-        <w:rPr>
-          <w:sz w:val="22"/>
-          <w:szCs w:val="22"/>
-        </w:rPr>
-        <w:t xml:space="preserve">(10 periodos con deforestación (máx. observado), 2002-2023). </w:t>
-      </w:r>
-      <w:r>
-        <w:rPr>
-          <w:sz w:val="22"/>
-          <w:szCs w:val="22"/>
-        </w:rPr>
-        <w:t xml:space="preserve">Las celdas más recurrentes de la jurisdicción (piedemonte de Mutatá y Dabeiba, eje de la vía al mar) registran deforestación en 10 de los 12 periodos mapeados, con hasta 127 ha acumuladas por celda de 400 ha. Urrao (179), Turbo (165) y Dabeiba (152) tienen más celdas persistentes.</w:t>
+        <w:t xml:space="preserve">ACIA (Medio Atrato): el territorio colectivo más afectado </w:t>
+      </w:r>
+      <w:r>
+        <w:rPr>
+          <w:sz w:val="22"/>
+          <w:szCs w:val="22"/>
+        </w:rPr>
+        <w:t xml:space="preserve">(1.255 ha deforestadas, 2002-2023). </w:t>
+      </w:r>
+      <w:r>
+        <w:rPr>
+          <w:sz w:val="22"/>
+          <w:szCs w:val="22"/>
+        </w:rPr>
+        <w:t xml:space="preserve">El Consejo Comunitario Mayor del Medio Atrato acumula 1.255 ha deforestadas, el 55% de la pérdida en consejos comunitarios (2.269 ha). En proporción de su enorme territorio (174.778 ha) es un 0,7%, pero su tendencia acompaña la aceleración del Atrato.</w:t>
       </w:r>
     </w:p>
     <w:p>
@@ -9871,21 +9878,21 @@
           <w:sz w:val="22"/>
           <w:szCs w:val="22"/>
         </w:rPr>
-        <w:t xml:space="preserve">ACIA (Medio Atrato): el territorio colectivo más afectado </w:t>
-      </w:r>
-      <w:r>
-        <w:rPr>
-          <w:sz w:val="22"/>
-          <w:szCs w:val="22"/>
-        </w:rPr>
-        <w:t xml:space="preserve">(1.255 ha deforestadas, 2002-2023). </w:t>
-      </w:r>
-      <w:r>
-        <w:rPr>
-          <w:sz w:val="22"/>
-          <w:szCs w:val="22"/>
-        </w:rPr>
-        <w:t xml:space="preserve">El Consejo Comunitario Mayor del Medio Atrato acumula 1.255 ha deforestadas, el 55% de la pérdida en consejos comunitarios (2.269 ha). En proporción de su enorme territorio (174.778 ha) es un 0,7%, pero su tendencia acompaña la aceleración del Atrato.</w:t>
+        <w:t xml:space="preserve">Deforestación atomizada: 9.107 parches, mediana 1,7 ha </w:t>
+      </w:r>
+      <w:r>
+        <w:rPr>
+          <w:sz w:val="22"/>
+          <w:szCs w:val="22"/>
+        </w:rPr>
+        <w:t xml:space="preserve">(9.107 parches ≥1 ha en 12 periodos, 2002-2023). </w:t>
+      </w:r>
+      <w:r>
+        <w:rPr>
+          <w:sz w:val="22"/>
+          <w:szCs w:val="22"/>
+        </w:rPr>
+        <w:t xml:space="preserve">El 92% de los parches mide menos de 5 ha (64% del área); solo el 2,5% supera 10 ha pero aporta el 22,5% del área. El tamaño de parche es estable en el tiempo (~2,8 ha): el patrón es de colonización hormiga, no de grandes praderizaciones — con la excepción de Turbo (parche máximo de 738 ha).</w:t>
       </w:r>
     </w:p>
     <w:p>
@@ -9904,21 +9911,21 @@
           <w:sz w:val="22"/>
           <w:szCs w:val="22"/>
         </w:rPr>
-        <w:t xml:space="preserve">Deforestación atomizada: 9.107 parches, mediana 1,7 ha </w:t>
-      </w:r>
-      <w:r>
-        <w:rPr>
-          <w:sz w:val="22"/>
-          <w:szCs w:val="22"/>
-        </w:rPr>
-        <w:t xml:space="preserve">(9.107 parches ≥1 ha en 12 periodos, 2002-2023). </w:t>
-      </w:r>
-      <w:r>
-        <w:rPr>
-          <w:sz w:val="22"/>
-          <w:szCs w:val="22"/>
-        </w:rPr>
-        <w:t xml:space="preserve">El 92% de los parches mide menos de 5 ha (64% del área); solo el 2,5% supera 10 ha pero aporta el 22,5% del área. El tamaño de parche es estable en el tiempo (~2,8 ha): el patrón es de colonización hormiga, no de grandes praderizaciones — con la excepción de Turbo (parche máximo de 738 ha).</w:t>
+        <w:t xml:space="preserve">Caribe y Centro desaceleran; Atrato, Nutibara y Urrao aceleran </w:t>
+      </w:r>
+      <w:r>
+        <w:rPr>
+          <w:sz w:val="22"/>
+          <w:szCs w:val="22"/>
+        </w:rPr>
+        <w:t xml:space="preserve">(3 subregiones con tasa en aumento, 2017-2023 vs 2000-2008). </w:t>
+      </w:r>
+      <w:r>
+        <w:rPr>
+          <w:sz w:val="22"/>
+          <w:szCs w:val="22"/>
+        </w:rPr>
+        <w:t xml:space="preserve">La tasa relativa de pérdida (deforestación anual sobre bosque remanente) baja en Caribe (1,0%→0,3%) y Centro (0,5%→0,3%), pero sube en Atrato, Nutibara y Urrao. La frontera de deforestación se corre hacia las subregiones más boscosas — coherente con el desplazamiento hacia territorios étnicos.</w:t>
       </w:r>
     </w:p>
     <w:p>
@@ -9937,21 +9944,21 @@
           <w:sz w:val="22"/>
           <w:szCs w:val="22"/>
         </w:rPr>
-        <w:t xml:space="preserve">Caribe y Centro desaceleran; Atrato, Nutibara y Urrao aceleran </w:t>
-      </w:r>
-      <w:r>
-        <w:rPr>
-          <w:sz w:val="22"/>
-          <w:szCs w:val="22"/>
-        </w:rPr>
-        <w:t xml:space="preserve">(3 subregiones con tasa en aumento, 2017-2023 vs 2000-2008). </w:t>
-      </w:r>
-      <w:r>
-        <w:rPr>
-          <w:sz w:val="22"/>
-          <w:szCs w:val="22"/>
-        </w:rPr>
-        <w:t xml:space="preserve">La tasa relativa de pérdida (deforestación anual sobre bosque remanente) baja en Caribe (1,0%→0,3%) y Centro (0,5%→0,3%), pero sube en Atrato, Nutibara y Urrao. La frontera de deforestación se corre hacia las subregiones más boscosas — coherente con el desplazamiento hacia territorios étnicos.</w:t>
+        <w:t xml:space="preserve">El pico dentro de áreas protegidas fue 2015-2016 </w:t>
+      </w:r>
+      <w:r>
+        <w:rPr>
+          <w:sz w:val="22"/>
+          <w:szCs w:val="22"/>
+        </w:rPr>
+        <w:t xml:space="preserve">(730 ha en un solo periodo, 2015-2016). </w:t>
+      </w:r>
+      <w:r>
+        <w:rPr>
+          <w:sz w:val="22"/>
+          <w:szCs w:val="22"/>
+        </w:rPr>
+        <w:t xml:space="preserve">Durante el pico regional post-acuerdo, las áreas protegidas recibieron 730 ha de deforestación en un año (14,7% del total del periodo). La participación de las AP en la deforestación total muestra leve tendencia a la baja (-0,2 puntos porcentuales/año).</w:t>
       </w:r>
     </w:p>
     <w:p>
@@ -9970,21 +9977,50 @@
           <w:sz w:val="22"/>
           <w:szCs w:val="22"/>
         </w:rPr>
-        <w:t xml:space="preserve">El pico dentro de áreas protegidas fue 2015-2016 </w:t>
-      </w:r>
-      <w:r>
-        <w:rPr>
-          <w:sz w:val="22"/>
-          <w:szCs w:val="22"/>
-        </w:rPr>
-        <w:t xml:space="preserve">(730 ha en un solo periodo, 2015-2016). </w:t>
-      </w:r>
-      <w:r>
-        <w:rPr>
-          <w:sz w:val="22"/>
-          <w:szCs w:val="22"/>
-        </w:rPr>
-        <w:t xml:space="preserve">Durante el pico regional post-acuerdo, las áreas protegidas recibieron 730 ha de deforestación en un año (14,7% del total del periodo). La participación de las AP en la deforestación total muestra leve tendencia a la baja (-0,2 puntos porcentuales/año).</w:t>
+        <w:t xml:space="preserve">11.642 ha deforestadas en las cuencas monitoreadas </w:t>
+      </w:r>
+      <w:r>
+        <w:rPr>
+          <w:sz w:val="22"/>
+          <w:szCs w:val="22"/>
+        </w:rPr>
+        <w:t xml:space="preserve">(11.642 ha (11 periodos confiables), 2000-2023). </w:t>
+      </w:r>
+      <w:r>
+        <w:rPr>
+          <w:sz w:val="22"/>
+          <w:szCs w:val="22"/>
+        </w:rPr>
+        <w:t xml:space="preserve">Las 7 cuencas priorizadas (723.026 ha, 38,9% de la jurisdicción) acumulan 11.642 ha de deforestación en los periodos con área confiable. El análisis detectó y excluyó un defecto de datos: en 2021-2022 la columna de área venía sin recortar contra la cuenca (2,7 M ha reportadas).</w:t>
+      </w:r>
+    </w:p>
+    <w:p>
+      <w:pPr>
+        <w:pStyle w:val="Heading1"/>
+      </w:pPr>
+      <w:r>
+        <w:t xml:space="preserve">14. Recomendaciones y mejoras de la plataforma</w:t>
+      </w:r>
+    </w:p>
+    <w:p>
+      <w:pPr>
+        <w:spacing w:after="120" w:line="276"/>
+        <w:jc w:val="both"/>
+      </w:pPr>
+      <w:r>
+        <w:rPr>
+          <w:sz w:val="22"/>
+          <w:szCs w:val="22"/>
+        </w:rPr>
+        <w:t xml:space="preserve">El Observatorio es una base sólida y ampliable. Se proponen las siguientes mejoras, ordenadas por prioridad e impacto:</w:t>
+      </w:r>
+    </w:p>
+    <w:p>
+      <w:pPr>
+        <w:pStyle w:val="Heading2"/>
+      </w:pPr>
+      <w:r>
+        <w:t xml:space="preserve">14.1. Datos y análisis</w:t>
       </w:r>
     </w:p>
     <w:p>
@@ -10003,50 +10039,14 @@
           <w:sz w:val="22"/>
           <w:szCs w:val="22"/>
         </w:rPr>
-        <w:t xml:space="preserve">11.642 ha deforestadas en las cuencas monitoreadas </w:t>
-      </w:r>
-      <w:r>
-        <w:rPr>
-          <w:sz w:val="22"/>
-          <w:szCs w:val="22"/>
-        </w:rPr>
-        <w:t xml:space="preserve">(11.642 ha (11 periodos confiables), 2000-2023). </w:t>
-      </w:r>
-      <w:r>
-        <w:rPr>
-          <w:sz w:val="22"/>
-          <w:szCs w:val="22"/>
-        </w:rPr>
-        <w:t xml:space="preserve">Las 7 cuencas priorizadas (723.026 ha, 38,9% de la jurisdicción) acumulan 11.642 ha de deforestación en los periodos con área confiable. El análisis detectó y excluyó un defecto de datos: en 2021-2022 la columna de área venía sin recortar contra la cuenca (2,7 M ha reportadas).</w:t>
-      </w:r>
-    </w:p>
-    <w:p>
-      <w:pPr>
-        <w:pStyle w:val="Heading1"/>
-      </w:pPr>
-      <w:r>
-        <w:t xml:space="preserve">14. Recomendaciones y mejoras de la plataforma</w:t>
-      </w:r>
-    </w:p>
-    <w:p>
-      <w:pPr>
-        <w:spacing w:after="120" w:line="276"/>
-        <w:jc w:val="both"/>
-      </w:pPr>
-      <w:r>
-        <w:rPr>
-          <w:sz w:val="22"/>
-          <w:szCs w:val="22"/>
-        </w:rPr>
-        <w:t xml:space="preserve">El Observatorio es una base sólida y ampliable. Se proponen las siguientes mejoras, ordenadas por prioridad e impacto:</w:t>
-      </w:r>
-    </w:p>
-    <w:p>
-      <w:pPr>
-        <w:pStyle w:val="Heading2"/>
-      </w:pPr>
-      <w:r>
-        <w:t xml:space="preserve">14.1. Datos y análisis</w:t>
+        <w:t xml:space="preserve">Completar los periodos estimados. </w:t>
+      </w:r>
+      <w:r>
+        <w:rPr>
+          <w:sz w:val="22"/>
+          <w:szCs w:val="22"/>
+        </w:rPr>
+        <w:t xml:space="preserve">Incorporar los datos reales de 2010-2012, 2018-2019 y 2023-2024 (sección 12) para eliminar las estimaciones restantes; 2015-2016 ya se recuperó como dato medido.</w:t>
       </w:r>
     </w:p>
     <w:p>
@@ -10065,14 +10065,14 @@
           <w:sz w:val="22"/>
           <w:szCs w:val="22"/>
         </w:rPr>
-        <w:t xml:space="preserve">Completar los periodos estimados. </w:t>
-      </w:r>
-      <w:r>
-        <w:rPr>
-          <w:sz w:val="22"/>
-          <w:szCs w:val="22"/>
-        </w:rPr>
-        <w:t xml:space="preserve">Incorporar los datos reales de 2010-2012, 2018-2019, 2023-2024 y 2015-2016 (sección 12) para eliminar las estimaciones.</w:t>
+        <w:t xml:space="preserve">Cerrar los cruces cartográficos pendientes. </w:t>
+      </w:r>
+      <w:r>
+        <w:rPr>
+          <w:sz w:val="22"/>
+          <w:szCs w:val="22"/>
+        </w:rPr>
+        <w:t xml:space="preserve">Finalizar los cruces con ecosistemas estratégicos (acuíferos, humedales, manglares) y con la zonificación de conflicto de uso (aptitud forestal vs. realidad), pendientes por el peso de los shapefiles.</w:t>
       </w:r>
     </w:p>
     <w:p>
@@ -10091,14 +10091,14 @@
           <w:sz w:val="22"/>
           <w:szCs w:val="22"/>
         </w:rPr>
-        <w:t xml:space="preserve">Cerrar los cruces cartográficos pendientes. </w:t>
-      </w:r>
-      <w:r>
-        <w:rPr>
-          <w:sz w:val="22"/>
-          <w:szCs w:val="22"/>
-        </w:rPr>
-        <w:t xml:space="preserve">Finalizar los cruces con ecosistemas estratégicos (acuíferos, humedales, manglares) y con la zonificación de conflicto de uso (aptitud forestal vs. realidad), pendientes por el peso de los shapefiles.</w:t>
+        <w:t xml:space="preserve">Modelo predictivo mejorado. </w:t>
+      </w:r>
+      <w:r>
+        <w:rPr>
+          <w:sz w:val="22"/>
+          <w:szCs w:val="22"/>
+        </w:rPr>
+        <w:t xml:space="preserve">Sustituir la regresión lineal actual por un modelo que incorpore variables explicativas (cercanía a vías, frentes persistentes, presión previa) para pronósticos por municipio más robustos.</w:t>
       </w:r>
     </w:p>
     <w:p>
@@ -10117,14 +10117,22 @@
           <w:sz w:val="22"/>
           <w:szCs w:val="22"/>
         </w:rPr>
-        <w:t xml:space="preserve">Modelo predictivo mejorado. </w:t>
-      </w:r>
-      <w:r>
-        <w:rPr>
-          <w:sz w:val="22"/>
-          <w:szCs w:val="22"/>
-        </w:rPr>
-        <w:t xml:space="preserve">Sustituir la regresión lineal actual por un modelo que incorpore variables explicativas (cercanía a vías, frentes persistentes, presión previa) para pronósticos por municipio más robustos.</w:t>
+        <w:t xml:space="preserve">Alertas tempranas. </w:t>
+      </w:r>
+      <w:r>
+        <w:rPr>
+          <w:sz w:val="22"/>
+          <w:szCs w:val="22"/>
+        </w:rPr>
+        <w:t xml:space="preserve">Integrar las alertas trimestrales de deforestación del IDEAM para pasar de un monitoreo bienal a un seguimiento casi en tiempo real.</w:t>
+      </w:r>
+    </w:p>
+    <w:p>
+      <w:pPr>
+        <w:pStyle w:val="Heading2"/>
+      </w:pPr>
+      <w:r>
+        <w:t xml:space="preserve">14.2. Funcionalidad y experiencia de usuario</w:t>
       </w:r>
     </w:p>
     <w:p>
@@ -10143,22 +10151,14 @@
           <w:sz w:val="22"/>
           <w:szCs w:val="22"/>
         </w:rPr>
-        <w:t xml:space="preserve">Alertas tempranas. </w:t>
-      </w:r>
-      <w:r>
-        <w:rPr>
-          <w:sz w:val="22"/>
-          <w:szCs w:val="22"/>
-        </w:rPr>
-        <w:t xml:space="preserve">Integrar las alertas trimestrales de deforestación del IDEAM para pasar de un monitoreo bienal a un seguimiento casi en tiempo real.</w:t>
-      </w:r>
-    </w:p>
-    <w:p>
-      <w:pPr>
-        <w:pStyle w:val="Heading2"/>
-      </w:pPr>
-      <w:r>
-        <w:t xml:space="preserve">14.2. Funcionalidad y experiencia de usuario</w:t>
+        <w:t xml:space="preserve">Comparador de territorios en el tiempo. </w:t>
+      </w:r>
+      <w:r>
+        <w:rPr>
+          <w:sz w:val="22"/>
+          <w:szCs w:val="22"/>
+        </w:rPr>
+        <w:t xml:space="preserve">Gráfico de línea que muestre la evolución de la deforestación de un área protegida, POMCA o resguardo a lo largo de todos los periodos.</w:t>
       </w:r>
     </w:p>
     <w:p>
@@ -10177,14 +10177,14 @@
           <w:sz w:val="22"/>
           <w:szCs w:val="22"/>
         </w:rPr>
-        <w:t xml:space="preserve">Comparador de territorios en el tiempo. </w:t>
-      </w:r>
-      <w:r>
-        <w:rPr>
-          <w:sz w:val="22"/>
-          <w:szCs w:val="22"/>
-        </w:rPr>
-        <w:t xml:space="preserve">Gráfico de línea que muestre la evolución de la deforestación de un área protegida, POMCA o resguardo a lo largo de todos los periodos.</w:t>
+        <w:t xml:space="preserve">Descarga de reportes por municipio. </w:t>
+      </w:r>
+      <w:r>
+        <w:rPr>
+          <w:sz w:val="22"/>
+          <w:szCs w:val="22"/>
+        </w:rPr>
+        <w:t xml:space="preserve">Botón que genere una ficha PDF/Word automática por municipio con sus cifras clave.</w:t>
       </w:r>
     </w:p>
     <w:p>
@@ -10203,14 +10203,14 @@
           <w:sz w:val="22"/>
           <w:szCs w:val="22"/>
         </w:rPr>
-        <w:t xml:space="preserve">Descarga de reportes por municipio. </w:t>
-      </w:r>
-      <w:r>
-        <w:rPr>
-          <w:sz w:val="22"/>
-          <w:szCs w:val="22"/>
-        </w:rPr>
-        <w:t xml:space="preserve">Botón que genere una ficha PDF/Word automática por municipio con sus cifras clave.</w:t>
+        <w:t xml:space="preserve">Búsqueda y geolocalización. </w:t>
+      </w:r>
+      <w:r>
+        <w:rPr>
+          <w:sz w:val="22"/>
+          <w:szCs w:val="22"/>
+        </w:rPr>
+        <w:t xml:space="preserve">Buscador de municipios/territorios y opción de centrar el mapa en la ubicación del usuario.</w:t>
       </w:r>
     </w:p>
     <w:p>
@@ -10229,14 +10229,14 @@
           <w:sz w:val="22"/>
           <w:szCs w:val="22"/>
         </w:rPr>
-        <w:t xml:space="preserve">Búsqueda y geolocalización. </w:t>
-      </w:r>
-      <w:r>
-        <w:rPr>
-          <w:sz w:val="22"/>
-          <w:szCs w:val="22"/>
-        </w:rPr>
-        <w:t xml:space="preserve">Buscador de municipios/territorios y opción de centrar el mapa en la ubicación del usuario.</w:t>
+        <w:t xml:space="preserve">Accesibilidad y multilenguaje. </w:t>
+      </w:r>
+      <w:r>
+        <w:rPr>
+          <w:sz w:val="22"/>
+          <w:szCs w:val="22"/>
+        </w:rPr>
+        <w:t xml:space="preserve">Auditoría de accesibilidad (lectores de pantalla, contraste) y versión en inglés para divulgación internacional.</w:t>
       </w:r>
     </w:p>
     <w:p>
@@ -10255,14 +10255,22 @@
           <w:sz w:val="22"/>
           <w:szCs w:val="22"/>
         </w:rPr>
-        <w:t xml:space="preserve">Accesibilidad y multilenguaje. </w:t>
-      </w:r>
-      <w:r>
-        <w:rPr>
-          <w:sz w:val="22"/>
-          <w:szCs w:val="22"/>
-        </w:rPr>
-        <w:t xml:space="preserve">Auditoría de accesibilidad (lectores de pantalla, contraste) y versión en inglés para divulgación internacional.</w:t>
+        <w:t xml:space="preserve">Cuadros de indicadores imprimibles. </w:t>
+      </w:r>
+      <w:r>
+        <w:rPr>
+          <w:sz w:val="22"/>
+          <w:szCs w:val="22"/>
+        </w:rPr>
+        <w:t xml:space="preserve">Vista «para imprimir» del tablero, útil en informes institucionales.</w:t>
+      </w:r>
+    </w:p>
+    <w:p>
+      <w:pPr>
+        <w:pStyle w:val="Heading2"/>
+      </w:pPr>
+      <w:r>
+        <w:t xml:space="preserve">14.3. Técnicas y despliegue</w:t>
       </w:r>
     </w:p>
     <w:p>
@@ -10281,22 +10289,14 @@
           <w:sz w:val="22"/>
           <w:szCs w:val="22"/>
         </w:rPr>
-        <w:t xml:space="preserve">Cuadros de indicadores imprimibles. </w:t>
-      </w:r>
-      <w:r>
-        <w:rPr>
-          <w:sz w:val="22"/>
-          <w:szCs w:val="22"/>
-        </w:rPr>
-        <w:t xml:space="preserve">Vista «para imprimir» del tablero, útil en informes institucionales.</w:t>
-      </w:r>
-    </w:p>
-    <w:p>
-      <w:pPr>
-        <w:pStyle w:val="Heading2"/>
-      </w:pPr>
-      <w:r>
-        <w:t xml:space="preserve">14.3. Técnicas y despliegue</w:t>
+        <w:t xml:space="preserve">Base de datos espacial. </w:t>
+      </w:r>
+      <w:r>
+        <w:rPr>
+          <w:sz w:val="22"/>
+          <w:szCs w:val="22"/>
+        </w:rPr>
+        <w:t xml:space="preserve">Migrar de archivos a PostgreSQL + PostGIS (ya soportado) para escalar consultas y habilitar filtros espaciales dinámicos.</w:t>
       </w:r>
     </w:p>
     <w:p>
@@ -10315,14 +10315,14 @@
           <w:sz w:val="22"/>
           <w:szCs w:val="22"/>
         </w:rPr>
-        <w:t xml:space="preserve">Base de datos espacial. </w:t>
-      </w:r>
-      <w:r>
-        <w:rPr>
-          <w:sz w:val="22"/>
-          <w:szCs w:val="22"/>
-        </w:rPr>
-        <w:t xml:space="preserve">Migrar de archivos a PostgreSQL + PostGIS (ya soportado) para escalar consultas y habilitar filtros espaciales dinámicos.</w:t>
+        <w:t xml:space="preserve">Publicación en línea. </w:t>
+      </w:r>
+      <w:r>
+        <w:rPr>
+          <w:sz w:val="22"/>
+          <w:szCs w:val="22"/>
+        </w:rPr>
+        <w:t xml:space="preserve">Desplegar el frontend (Vercel/Netlify) y el backend (contenedor Docker) con un dominio institucional, y teselas vectoriales para acelerar el mapa.</w:t>
       </w:r>
     </w:p>
     <w:p>
@@ -10341,14 +10341,14 @@
           <w:sz w:val="22"/>
           <w:szCs w:val="22"/>
         </w:rPr>
-        <w:t xml:space="preserve">Publicación en línea. </w:t>
-      </w:r>
-      <w:r>
-        <w:rPr>
-          <w:sz w:val="22"/>
-          <w:szCs w:val="22"/>
-        </w:rPr>
-        <w:t xml:space="preserve">Desplegar el frontend (Vercel/Netlify) y el backend (contenedor Docker) con un dominio institucional, y teselas vectoriales para acelerar el mapa.</w:t>
+        <w:t xml:space="preserve">Actualización automatizada. </w:t>
+      </w:r>
+      <w:r>
+        <w:rPr>
+          <w:sz w:val="22"/>
+          <w:szCs w:val="22"/>
+        </w:rPr>
+        <w:t xml:space="preserve">Programar la ejecución del ETL cuando CORPOURABA publique un nuevo periodo, con validación automática de calidad.</w:t>
       </w:r>
     </w:p>
     <w:p>
@@ -10367,32 +10367,6 @@
           <w:sz w:val="22"/>
           <w:szCs w:val="22"/>
         </w:rPr>
-        <w:t xml:space="preserve">Actualización automatizada. </w:t>
-      </w:r>
-      <w:r>
-        <w:rPr>
-          <w:sz w:val="22"/>
-          <w:szCs w:val="22"/>
-        </w:rPr>
-        <w:t xml:space="preserve">Programar la ejecución del ETL cuando CORPOURABA publique un nuevo periodo, con validación automática de calidad.</w:t>
-      </w:r>
-    </w:p>
-    <w:p>
-      <w:pPr>
-        <w:pStyle w:val="ListParagraph"/>
-        <w:numPr>
-          <w:ilvl w:val="0"/>
-          <w:numId w:val="2"/>
-        </w:numPr>
-        <w:spacing w:after="60"/>
-      </w:pPr>
-      <w:r>
-        <w:rPr>
-          <w:b/>
-          <w:bCs/>
-          <w:sz w:val="22"/>
-          <w:szCs w:val="22"/>
-        </w:rPr>
         <w:t xml:space="preserve">API pública documentada. </w:t>
       </w:r>
       <w:r>
@@ -10421,7 +10395,7 @@
           <w:sz w:val="22"/>
           <w:szCs w:val="22"/>
         </w:rPr>
-        <w:t xml:space="preserve">En 24 años, la jurisdicción de CORPOURABA perdió cerca de 46.044 hectáreas de bosque. Aunque la tasa anual muestra una tendencia general a la baja frente a los picos de la década de 2000 y de 2015-2016, la deforestación no se detiene: se concentra en frentes persistentes y se desplaza hacia las subregiones más boscosas y hacia los territorios colectivos, áreas protegidas y reservas de ley.</w:t>
+        <w:t xml:space="preserve">En 24 años, la jurisdicción de CORPOURABA perdió cerca de 46.846 hectáreas de bosque. Aunque la tasa anual muestra una tendencia general a la baja frente a los picos de la década de 2000 y de 2015-2016, la deforestación no se detiene: se concentra en frentes persistentes y se desplaza hacia las subregiones más boscosas y hacia los territorios colectivos, áreas protegidas y reservas de ley.</w:t>
       </w:r>
     </w:p>
     <w:p>
@@ -11277,7 +11251,7 @@
                 <w:sz w:val="20"/>
                 <w:szCs w:val="20"/>
               </w:rPr>
-              <w:t xml:space="preserve">cuencas (parcial)</w:t>
+              <w:t xml:space="preserve">tabla municipal (dbf)</w:t>
             </w:r>
           </w:p>
         </w:tc>

</xml_diff>

<commit_message>
Regenera los análisis temáticos consistentes con los hotspots < 1 ha
Al bajar el umbral a 0,09 ha, se recalcularon los 5 análisis que leen los
hotspots (fragmentación/recurrencia, minería, POMCAS, figuras de protección,
territorios colectivos) y se actualizaron los números derivados en toda la
plataforma y los entregables:

- Minería (títulos+solicitudes): 30,2% -> 40,8% de lo mapeado
- Frentes persistentes (>=3 periodos): 72% -> 78,9% (1.039 -> 1.411 celdas)
- POMCA Río León: 3.860 -> 4.738 ha; parches: 9.107 -> 19.023
- Actualiza hallazgos.json, contenido.ts (aprende), soporte documental
  (metodología), Informe Word y Excel (recalculado, 0 errores)
- AP (12,6%), cuencas y territorios étnicos no cambian (no leen hotspots)

Co-Authored-By: Claude Opus 4.8 <noreply@anthropic.com>
</commit_message>
<xml_diff>
--- a/entregables/Informe_Deforestacion_CORPOURABA_2000-2024.docx
+++ b/entregables/Informe_Deforestacion_CORPOURABA_2000-2024.docx
@@ -382,7 +382,7 @@
           <w:sz w:val="22"/>
           <w:szCs w:val="22"/>
         </w:rPr>
-        <w:t xml:space="preserve">En 2002-2010 los resguardos indígenas y consejos comunitarios concentraban el 16,4% de la deforestación mapeada; en 2019-2023 concentran el 40,9%. La presión se movió hacia los territorios colectivos mientras el resto de la jurisdicción desacelera.</w:t>
+        <w:t xml:space="preserve">En 2002-2010 los resguardos indígenas y consejos comunitarios concentraban el 16,6% de la deforestación mapeada; en 2019-2023 concentran el 40,6%. La presión se movió hacia los territorios colectivos mientras el resto de la jurisdicción desacelera.</w:t>
       </w:r>
     </w:p>
     <w:p>
@@ -427,14 +427,14 @@
           <w:sz w:val="22"/>
           <w:szCs w:val="22"/>
         </w:rPr>
-        <w:t xml:space="preserve">72% de la pérdida ocurre en frentes persistentes: </w:t>
-      </w:r>
-      <w:r>
-        <w:rPr>
-          <w:sz w:val="22"/>
-          <w:szCs w:val="22"/>
-        </w:rPr>
-        <w:t xml:space="preserve">1.039 celdas de 2×2 km registran deforestación en 3 o más periodos y concentran el 72,2% de las hectáreas deforestadas mapeadas. No son eventos dispersos: son frentes activos y localizables, priorizables para control.</w:t>
+        <w:t xml:space="preserve">79% de la pérdida ocurre en frentes persistentes: </w:t>
+      </w:r>
+      <w:r>
+        <w:rPr>
+          <w:sz w:val="22"/>
+          <w:szCs w:val="22"/>
+        </w:rPr>
+        <w:t xml:space="preserve">1.411 celdas de 2×2 km registran deforestación en 3 o más periodos y concentran el 78,9% de las hectáreas deforestadas mapeadas. No son eventos dispersos: son frentes activos y localizables, priorizables para control.</w:t>
       </w:r>
     </w:p>
     <w:p>
@@ -7214,7 +7214,7 @@
           <w:sz w:val="22"/>
           <w:szCs w:val="22"/>
         </w:rPr>
-        <w:t xml:space="preserve">9.107</w:t>
+        <w:t xml:space="preserve">19.023</w:t>
       </w:r>
       <w:r>
         <w:rPr>
@@ -7230,7 +7230,7 @@
           <w:sz w:val="22"/>
           <w:szCs w:val="22"/>
         </w:rPr>
-        <w:t xml:space="preserve">2,8 ha</w:t>
+        <w:t xml:space="preserve">1,6 ha</w:t>
       </w:r>
       <w:r>
         <w:rPr>
@@ -7246,14 +7246,14 @@
           <w:sz w:val="22"/>
           <w:szCs w:val="22"/>
         </w:rPr>
-        <w:t xml:space="preserve">1,7 ha</w:t>
-      </w:r>
-      <w:r>
-        <w:rPr>
-          <w:sz w:val="22"/>
-          <w:szCs w:val="22"/>
-        </w:rPr>
-        <w:t xml:space="preserve">. El 91,9 % de los parches mide menos de 5 ha, señal de una colonización gradual («hormiga») más que de grandes praderizaciones.</w:t>
+        <w:t xml:space="preserve">1,0 ha</w:t>
+      </w:r>
+      <w:r>
+        <w:rPr>
+          <w:sz w:val="22"/>
+          <w:szCs w:val="22"/>
+        </w:rPr>
+        <w:t xml:space="preserve">. El 96,1 % de los parches mide menos de 5 ha, señal de una colonización gradual («hormiga») más que de grandes praderizaciones.</w:t>
       </w:r>
     </w:p>
     <w:p>
@@ -7275,7 +7275,7 @@
           <w:sz w:val="22"/>
           <w:szCs w:val="22"/>
         </w:rPr>
-        <w:t xml:space="preserve">Al superponer una rejilla de 2×2 km sobre la jurisdicción, 1.039 celdas registran deforestación en tres o más periodos y concentran el </w:t>
+        <w:t xml:space="preserve">Al superponer una rejilla de 2×2 km sobre la jurisdicción, 1.411 celdas registran deforestación en tres o más periodos y concentran el </w:t>
       </w:r>
       <w:r>
         <w:rPr>
@@ -7284,7 +7284,7 @@
           <w:sz w:val="22"/>
           <w:szCs w:val="22"/>
         </w:rPr>
-        <w:t xml:space="preserve">72,2 %</w:t>
+        <w:t xml:space="preserve">78,9 %</w:t>
       </w:r>
       <w:r>
         <w:rPr>
@@ -8573,7 +8573,7 @@
           <w:sz w:val="22"/>
           <w:szCs w:val="22"/>
         </w:rPr>
-        <w:t xml:space="preserve">8.724 ha</w:t>
+        <w:t xml:space="preserve">10.718 ha</w:t>
       </w:r>
       <w:r>
         <w:rPr>
@@ -8751,7 +8751,7 @@
                 <w:sz w:val="20"/>
                 <w:szCs w:val="20"/>
               </w:rPr>
-              <w:t xml:space="preserve">3.860,1</w:t>
+              <w:t xml:space="preserve">4.738,5</w:t>
             </w:r>
           </w:p>
         </w:tc>
@@ -8774,7 +8774,7 @@
                 <w:sz w:val="20"/>
                 <w:szCs w:val="20"/>
               </w:rPr>
-              <w:t xml:space="preserve">1,76 %</w:t>
+              <w:t xml:space="preserve">2,16 %</w:t>
             </w:r>
           </w:p>
         </w:tc>
@@ -8824,7 +8824,7 @@
                 <w:sz w:val="20"/>
                 <w:szCs w:val="20"/>
               </w:rPr>
-              <w:t xml:space="preserve">2.225,2</w:t>
+              <w:t xml:space="preserve">2.739,2</w:t>
             </w:r>
           </w:p>
         </w:tc>
@@ -8848,7 +8848,7 @@
                 <w:sz w:val="20"/>
                 <w:szCs w:val="20"/>
               </w:rPr>
-              <w:t xml:space="preserve">2,49 %</w:t>
+              <w:t xml:space="preserve">3,07 %</w:t>
             </w:r>
           </w:p>
         </w:tc>
@@ -8896,7 +8896,7 @@
                 <w:sz w:val="20"/>
                 <w:szCs w:val="20"/>
               </w:rPr>
-              <w:t xml:space="preserve">1.747,2</w:t>
+              <w:t xml:space="preserve">2.368,2</w:t>
             </w:r>
           </w:p>
         </w:tc>
@@ -8919,7 +8919,7 @@
                 <w:sz w:val="20"/>
                 <w:szCs w:val="20"/>
               </w:rPr>
-              <w:t xml:space="preserve">0,80 %</w:t>
+              <w:t xml:space="preserve">1,09 %</w:t>
             </w:r>
           </w:p>
         </w:tc>
@@ -8969,7 +8969,7 @@
                 <w:sz w:val="20"/>
                 <w:szCs w:val="20"/>
               </w:rPr>
-              <w:t xml:space="preserve">493,8</w:t>
+              <w:t xml:space="preserve">537,2</w:t>
             </w:r>
           </w:p>
         </w:tc>
@@ -8993,7 +8993,7 @@
                 <w:sz w:val="20"/>
                 <w:szCs w:val="20"/>
               </w:rPr>
-              <w:t xml:space="preserve">0,35 %</w:t>
+              <w:t xml:space="preserve">0,38 %</w:t>
             </w:r>
           </w:p>
         </w:tc>
@@ -9041,7 +9041,7 @@
                 <w:sz w:val="20"/>
                 <w:szCs w:val="20"/>
               </w:rPr>
-              <w:t xml:space="preserve">307,2</w:t>
+              <w:t xml:space="preserve">234,2</w:t>
             </w:r>
           </w:p>
         </w:tc>
@@ -9064,7 +9064,7 @@
                 <w:sz w:val="20"/>
                 <w:szCs w:val="20"/>
               </w:rPr>
-              <w:t xml:space="preserve">0,13 %</w:t>
+              <w:t xml:space="preserve">0,10 %</w:t>
             </w:r>
           </w:p>
         </w:tc>
@@ -9114,7 +9114,7 @@
                 <w:sz w:val="20"/>
                 <w:szCs w:val="20"/>
               </w:rPr>
-              <w:t xml:space="preserve">49,5</w:t>
+              <w:t xml:space="preserve">58,3</w:t>
             </w:r>
           </w:p>
         </w:tc>
@@ -9138,7 +9138,7 @@
                 <w:sz w:val="20"/>
                 <w:szCs w:val="20"/>
               </w:rPr>
-              <w:t xml:space="preserve">0,37 %</w:t>
+              <w:t xml:space="preserve">0,44 %</w:t>
             </w:r>
           </w:p>
         </w:tc>
@@ -9186,7 +9186,7 @@
                 <w:sz w:val="20"/>
                 <w:szCs w:val="20"/>
               </w:rPr>
-              <w:t xml:space="preserve">41,4</w:t>
+              <w:t xml:space="preserve">42,7</w:t>
             </w:r>
           </w:p>
         </w:tc>
@@ -9555,14 +9555,14 @@
           <w:sz w:val="22"/>
           <w:szCs w:val="22"/>
         </w:rPr>
-        <w:t xml:space="preserve">(40,9 % de la deforestación mapeada, 2019-2023). </w:t>
-      </w:r>
-      <w:r>
-        <w:rPr>
-          <w:sz w:val="22"/>
-          <w:szCs w:val="22"/>
-        </w:rPr>
-        <w:t xml:space="preserve">En 2002-2010 los resguardos indígenas y consejos comunitarios concentraban el 16,4% de la deforestación mapeada; en 2019-2023 concentran el 40,9%. La presión se movió hacia los territorios colectivos mientras el resto de la jurisdicción desacelera.</w:t>
+        <w:t xml:space="preserve">(40,6 % de la deforestación mapeada, 2019-2023). </w:t>
+      </w:r>
+      <w:r>
+        <w:rPr>
+          <w:sz w:val="22"/>
+          <w:szCs w:val="22"/>
+        </w:rPr>
+        <w:t xml:space="preserve">En 2002-2010 los resguardos indígenas y consejos comunitarios concentraban el 16,6% de la deforestación mapeada; en 2019-2023 concentran el 40,6%. La presión se movió hacia los territorios colectivos mientras el resto de la jurisdicción desacelera.</w:t>
       </w:r>
     </w:p>
     <w:p>
@@ -9614,21 +9614,21 @@
           <w:sz w:val="22"/>
           <w:szCs w:val="22"/>
         </w:rPr>
-        <w:t xml:space="preserve">72% de la pérdida ocurre en frentes persistentes </w:t>
-      </w:r>
-      <w:r>
-        <w:rPr>
-          <w:sz w:val="22"/>
-          <w:szCs w:val="22"/>
-        </w:rPr>
-        <w:t xml:space="preserve">(72,2 % de ha en celdas recurrentes, 2002-2023). </w:t>
-      </w:r>
-      <w:r>
-        <w:rPr>
-          <w:sz w:val="22"/>
-          <w:szCs w:val="22"/>
-        </w:rPr>
-        <w:t xml:space="preserve">1.039 celdas de 2×2 km registran deforestación en 3 o más periodos y concentran el 72,2% de las hectáreas deforestadas mapeadas. No son eventos dispersos: son frentes activos y localizables, priorizables para control.</w:t>
+        <w:t xml:space="preserve">79% de la pérdida ocurre en frentes persistentes </w:t>
+      </w:r>
+      <w:r>
+        <w:rPr>
+          <w:sz w:val="22"/>
+          <w:szCs w:val="22"/>
+        </w:rPr>
+        <w:t xml:space="preserve">(78,9 % de ha en celdas recurrentes, 2002-2023). </w:t>
+      </w:r>
+      <w:r>
+        <w:rPr>
+          <w:sz w:val="22"/>
+          <w:szCs w:val="22"/>
+        </w:rPr>
+        <w:t xml:space="preserve">1.411 celdas de 2×2 km registran deforestación en 3 o más periodos y concentran el 78,9% de las hectáreas deforestadas mapeadas. No son eventos dispersos: son frentes activos y localizables, priorizables para control.</w:t>
       </w:r>
     </w:p>
     <w:p>
@@ -9812,21 +9812,21 @@
           <w:sz w:val="22"/>
           <w:szCs w:val="22"/>
         </w:rPr>
-        <w:t xml:space="preserve">Frentes activos 10 de 12 periodos en Mutatá y Dabeiba </w:t>
-      </w:r>
-      <w:r>
-        <w:rPr>
-          <w:sz w:val="22"/>
-          <w:szCs w:val="22"/>
-        </w:rPr>
-        <w:t xml:space="preserve">(10 periodos con deforestación (máx. observado), 2002-2023). </w:t>
-      </w:r>
-      <w:r>
-        <w:rPr>
-          <w:sz w:val="22"/>
-          <w:szCs w:val="22"/>
-        </w:rPr>
-        <w:t xml:space="preserve">Las celdas más recurrentes de la jurisdicción (piedemonte de Mutatá y Dabeiba, eje de la vía al mar) registran deforestación en 10 de los 12 periodos mapeados, con hasta 127 ha acumuladas por celda de 400 ha. Urrao (179), Turbo (165) y Dabeiba (152) tienen más celdas persistentes.</w:t>
+        <w:t xml:space="preserve">Frentes activos 11 de 12 periodos en Mutatá y Dabeiba </w:t>
+      </w:r>
+      <w:r>
+        <w:rPr>
+          <w:sz w:val="22"/>
+          <w:szCs w:val="22"/>
+        </w:rPr>
+        <w:t xml:space="preserve">(11 periodos con deforestación (máx. observado), 2002-2023). </w:t>
+      </w:r>
+      <w:r>
+        <w:rPr>
+          <w:sz w:val="22"/>
+          <w:szCs w:val="22"/>
+        </w:rPr>
+        <w:t xml:space="preserve">Las celdas más recurrentes de la jurisdicción (piedemonte de Mutatá y Dabeiba, eje de la vía al mar) registran deforestación en 11 de los 12 periodos mapeados, con hasta 136 ha acumuladas por celda de 400 ha. Urrao (249), Turbo (221) y Dabeiba (203) tienen más celdas persistentes.</w:t>
       </w:r>
     </w:p>
     <w:p>
@@ -9878,21 +9878,21 @@
           <w:sz w:val="22"/>
           <w:szCs w:val="22"/>
         </w:rPr>
-        <w:t xml:space="preserve">Deforestación atomizada: 9.107 parches, mediana 1,7 ha </w:t>
-      </w:r>
-      <w:r>
-        <w:rPr>
-          <w:sz w:val="22"/>
-          <w:szCs w:val="22"/>
-        </w:rPr>
-        <w:t xml:space="preserve">(9.107 parches ≥1 ha en 12 periodos, 2002-2023). </w:t>
-      </w:r>
-      <w:r>
-        <w:rPr>
-          <w:sz w:val="22"/>
-          <w:szCs w:val="22"/>
-        </w:rPr>
-        <w:t xml:space="preserve">El 92% de los parches mide menos de 5 ha (64% del área); solo el 2,5% supera 10 ha pero aporta el 22,5% del área. El tamaño de parche es estable en el tiempo (~2,8 ha): el patrón es de colonización hormiga, no de grandes praderizaciones — con la excepción de Turbo (parche máximo de 738 ha).</w:t>
+        <w:t xml:space="preserve">Deforestación atomizada: 19.023 parches, mediana 1 ha </w:t>
+      </w:r>
+      <w:r>
+        <w:rPr>
+          <w:sz w:val="22"/>
+          <w:szCs w:val="22"/>
+        </w:rPr>
+        <w:t xml:space="preserve">(19.023 parches en 12 periodos (incluye &lt; 1 ha), 2002-2023). </w:t>
+      </w:r>
+      <w:r>
+        <w:rPr>
+          <w:sz w:val="22"/>
+          <w:szCs w:val="22"/>
+        </w:rPr>
+        <w:t xml:space="preserve">El 96% de los parches mide menos de 5 ha (70% del área); solo el 1,2% supera 10 ha pero aporta el 19% del área. El tamaño medio de parche es pequeño (~1,6 ha; mediana 0,95 ha) e incluye ahora los focos de menos de 1 ha: el patrón es de colonización hormiga, no de grandes praderizaciones — con la excepción de Turbo (parche máximo de 738 ha).</w:t>
       </w:r>
     </w:p>
     <w:p>

</xml_diff>